<commit_message>
AdD PC direction check
</commit_message>
<xml_diff>
--- a/decoding-analysis/revision_memos/meeting notes.docx
+++ b/decoding-analysis/revision_memos/meeting notes.docx
@@ -51,7 +51,15 @@
     </w:p>
     <w:p>
       <w:r>
-        <w:t>Geometric mean of means: product of two means</w:t>
+        <w:t xml:space="preserve">Geometric </w:t>
+      </w:r>
+      <w:proofErr w:type="gramStart"/>
+      <w:r>
+        <w:t>mean</w:t>
+      </w:r>
+      <w:proofErr w:type="gramEnd"/>
+      <w:r>
+        <w:t xml:space="preserve"> of means: product of two means</w:t>
       </w:r>
     </w:p>
     <w:p>
@@ -121,7 +129,23 @@
           <w:b/>
           <w:bCs/>
         </w:rPr>
-        <w:t>Variance and mean of noise correlation</w:t>
+        <w:t xml:space="preserve">Variance and </w:t>
+      </w:r>
+      <w:proofErr w:type="gramStart"/>
+      <w:r>
+        <w:rPr>
+          <w:b/>
+          <w:bCs/>
+        </w:rPr>
+        <w:t>mean</w:t>
+      </w:r>
+      <w:proofErr w:type="gramEnd"/>
+      <w:r>
+        <w:rPr>
+          <w:b/>
+          <w:bCs/>
+        </w:rPr>
+        <w:t xml:space="preserve"> of noise correlation</w:t>
       </w:r>
       <w:r>
         <w:rPr>
@@ -135,7 +159,23 @@
           <w:b/>
           <w:bCs/>
         </w:rPr>
-        <w:t>, you get a two-dimensional plot. Mean as x and variance as y. each point is one neuron</w:t>
+        <w:t xml:space="preserve">, you get a two-dimensional plot. Mean as x and variance as y. </w:t>
+      </w:r>
+      <w:proofErr w:type="gramStart"/>
+      <w:r>
+        <w:rPr>
+          <w:b/>
+          <w:bCs/>
+        </w:rPr>
+        <w:t>each</w:t>
+      </w:r>
+      <w:proofErr w:type="gramEnd"/>
+      <w:r>
+        <w:rPr>
+          <w:b/>
+          <w:bCs/>
+        </w:rPr>
+        <w:t xml:space="preserve"> point is one neuron</w:t>
       </w:r>
       <w:r>
         <w:rPr>
@@ -534,7 +574,23 @@
           <w:b/>
           <w:bCs/>
         </w:rPr>
-        <w:t>: stimPair wise or the all 50 stims</w:t>
+        <w:t xml:space="preserve">: stimPair wise or </w:t>
+      </w:r>
+      <w:proofErr w:type="gramStart"/>
+      <w:r>
+        <w:rPr>
+          <w:b/>
+          <w:bCs/>
+        </w:rPr>
+        <w:t>the all</w:t>
+      </w:r>
+      <w:proofErr w:type="gramEnd"/>
+      <w:r>
+        <w:rPr>
+          <w:b/>
+          <w:bCs/>
+        </w:rPr>
+        <w:t xml:space="preserve"> 50 stims</w:t>
       </w:r>
     </w:p>
     <w:p>
@@ -698,7 +754,23 @@
           <w:b/>
           <w:bCs/>
         </w:rPr>
-        <w:t xml:space="preserve"> in EC: what is the correlation? What is the null?</w:t>
+        <w:t xml:space="preserve"> in EC: what is the correlation? What is </w:t>
+      </w:r>
+      <w:proofErr w:type="gramStart"/>
+      <w:r>
+        <w:rPr>
+          <w:b/>
+          <w:bCs/>
+        </w:rPr>
+        <w:t>the null</w:t>
+      </w:r>
+      <w:proofErr w:type="gramEnd"/>
+      <w:r>
+        <w:rPr>
+          <w:b/>
+          <w:bCs/>
+        </w:rPr>
+        <w:t>?</w:t>
       </w:r>
     </w:p>
     <w:p>
@@ -817,6 +889,44 @@
           <w:bCs/>
         </w:rPr>
         <w:t>3. Compare Gabor and neurons with increasing predictors and report the intrinsic dimensions.</w:t>
+      </w:r>
+    </w:p>
+    <w:p>
+      <w:pPr>
+        <w:rPr>
+          <w:b/>
+          <w:bCs/>
+        </w:rPr>
+      </w:pPr>
+    </w:p>
+    <w:p>
+      <w:pPr>
+        <w:rPr>
+          <w:b/>
+          <w:bCs/>
+        </w:rPr>
+      </w:pPr>
+      <w:r>
+        <w:rPr>
+          <w:b/>
+          <w:bCs/>
+        </w:rPr>
+        <w:t>6/11/2026</w:t>
+      </w:r>
+    </w:p>
+    <w:p>
+      <w:pPr>
+        <w:rPr>
+          <w:b/>
+          <w:bCs/>
+        </w:rPr>
+      </w:pPr>
+      <w:r>
+        <w:rPr>
+          <w:b/>
+          <w:bCs/>
+        </w:rPr>
+        <w:t>1. Simple geometric metric with or without within-session correlation?</w:t>
       </w:r>
     </w:p>
     <w:sectPr>

</xml_diff>

<commit_message>
Compute FR V1 incremental PR
</commit_message>
<xml_diff>
--- a/decoding-analysis/revision_memos/meeting notes.docx
+++ b/decoding-analysis/revision_memos/meeting notes.docx
@@ -51,15 +51,7 @@
     </w:p>
     <w:p>
       <w:r>
-        <w:t xml:space="preserve">Geometric </w:t>
-      </w:r>
-      <w:proofErr w:type="gramStart"/>
-      <w:r>
-        <w:t>mean</w:t>
-      </w:r>
-      <w:proofErr w:type="gramEnd"/>
-      <w:r>
-        <w:t xml:space="preserve"> of means: product of two means</w:t>
+        <w:t>Geometric mean of means: product of two means</w:t>
       </w:r>
     </w:p>
     <w:p>
@@ -129,23 +121,7 @@
           <w:b/>
           <w:bCs/>
         </w:rPr>
-        <w:t xml:space="preserve">Variance and </w:t>
-      </w:r>
-      <w:proofErr w:type="gramStart"/>
-      <w:r>
-        <w:rPr>
-          <w:b/>
-          <w:bCs/>
-        </w:rPr>
-        <w:t>mean</w:t>
-      </w:r>
-      <w:proofErr w:type="gramEnd"/>
-      <w:r>
-        <w:rPr>
-          <w:b/>
-          <w:bCs/>
-        </w:rPr>
-        <w:t xml:space="preserve"> of noise correlation</w:t>
+        <w:t>Variance and mean of noise correlation</w:t>
       </w:r>
       <w:r>
         <w:rPr>
@@ -159,23 +135,7 @@
           <w:b/>
           <w:bCs/>
         </w:rPr>
-        <w:t xml:space="preserve">, you get a two-dimensional plot. Mean as x and variance as y. </w:t>
-      </w:r>
-      <w:proofErr w:type="gramStart"/>
-      <w:r>
-        <w:rPr>
-          <w:b/>
-          <w:bCs/>
-        </w:rPr>
-        <w:t>each</w:t>
-      </w:r>
-      <w:proofErr w:type="gramEnd"/>
-      <w:r>
-        <w:rPr>
-          <w:b/>
-          <w:bCs/>
-        </w:rPr>
-        <w:t xml:space="preserve"> point is one neuron</w:t>
+        <w:t>, you get a two-dimensional plot. Mean as x and variance as y. each point is one neuron</w:t>
       </w:r>
       <w:r>
         <w:rPr>
@@ -574,23 +534,7 @@
           <w:b/>
           <w:bCs/>
         </w:rPr>
-        <w:t xml:space="preserve">: stimPair wise or </w:t>
-      </w:r>
-      <w:proofErr w:type="gramStart"/>
-      <w:r>
-        <w:rPr>
-          <w:b/>
-          <w:bCs/>
-        </w:rPr>
-        <w:t>the all</w:t>
-      </w:r>
-      <w:proofErr w:type="gramEnd"/>
-      <w:r>
-        <w:rPr>
-          <w:b/>
-          <w:bCs/>
-        </w:rPr>
-        <w:t xml:space="preserve"> 50 stims</w:t>
+        <w:t>: stimPair wise or the all 50 stims</w:t>
       </w:r>
     </w:p>
     <w:p>
@@ -754,23 +698,7 @@
           <w:b/>
           <w:bCs/>
         </w:rPr>
-        <w:t xml:space="preserve"> in EC: what is the correlation? What is </w:t>
-      </w:r>
-      <w:proofErr w:type="gramStart"/>
-      <w:r>
-        <w:rPr>
-          <w:b/>
-          <w:bCs/>
-        </w:rPr>
-        <w:t>the null</w:t>
-      </w:r>
-      <w:proofErr w:type="gramEnd"/>
-      <w:r>
-        <w:rPr>
-          <w:b/>
-          <w:bCs/>
-        </w:rPr>
-        <w:t>?</w:t>
+        <w:t xml:space="preserve"> in EC: what is the correlation? What is the null?</w:t>
       </w:r>
     </w:p>
     <w:p>
@@ -916,17 +844,62 @@
     </w:p>
     <w:p>
       <w:pPr>
-        <w:rPr>
-          <w:b/>
-          <w:bCs/>
-        </w:rPr>
-      </w:pPr>
-      <w:r>
-        <w:rPr>
-          <w:b/>
-          <w:bCs/>
-        </w:rPr>
-        <w:t>1. Simple geometric metric with or without within-session correlation?</w:t>
+        <w:pStyle w:val="ListParagraph"/>
+        <w:numPr>
+          <w:ilvl w:val="0"/>
+          <w:numId w:val="2"/>
+        </w:numPr>
+        <w:rPr>
+          <w:b/>
+          <w:bCs/>
+        </w:rPr>
+      </w:pPr>
+      <w:r>
+        <w:rPr>
+          <w:b/>
+          <w:bCs/>
+        </w:rPr>
+        <w:t>Simple geometric metric with or without within-session correlation?</w:t>
+      </w:r>
+    </w:p>
+    <w:p>
+      <w:pPr>
+        <w:pStyle w:val="ListParagraph"/>
+        <w:numPr>
+          <w:ilvl w:val="0"/>
+          <w:numId w:val="2"/>
+        </w:numPr>
+        <w:rPr>
+          <w:b/>
+          <w:bCs/>
+        </w:rPr>
+      </w:pPr>
+      <w:r>
+        <w:rPr>
+          <w:b/>
+          <w:bCs/>
+        </w:rPr>
+        <w:t>Angles formed by the First PC axis and the connecting line</w:t>
+      </w:r>
+    </w:p>
+    <w:p>
+      <w:pPr>
+        <w:pStyle w:val="ListParagraph"/>
+        <w:numPr>
+          <w:ilvl w:val="0"/>
+          <w:numId w:val="2"/>
+        </w:numPr>
+        <w:rPr>
+          <w:b/>
+          <w:bCs/>
+        </w:rPr>
+      </w:pPr>
+      <w:r>
+        <w:rPr>
+          <w:b/>
+          <w:bCs/>
+        </w:rPr>
+        <w:t>Participation ratio vs. decoding for Gabor and neurons</w:t>
       </w:r>
     </w:p>
     <w:sectPr>
@@ -1080,8 +1053,100 @@
       </w:pPr>
     </w:lvl>
   </w:abstractNum>
+  <w:abstractNum w:abstractNumId="1" w15:restartNumberingAfterBreak="0">
+    <w:nsid w:val="72370A31"/>
+    <w:multiLevelType w:val="hybridMultilevel"/>
+    <w:tmpl w:val="379E2FA6"/>
+    <w:lvl w:ilvl="0" w:tplc="0409000F">
+      <w:start w:val="1"/>
+      <w:numFmt w:val="decimal"/>
+      <w:lvlText w:val="%1."/>
+      <w:lvlJc w:val="left"/>
+      <w:pPr>
+        <w:ind w:left="720" w:hanging="360"/>
+      </w:pPr>
+      <w:rPr>
+        <w:rFonts w:hint="default"/>
+      </w:rPr>
+    </w:lvl>
+    <w:lvl w:ilvl="1" w:tplc="04090019" w:tentative="1">
+      <w:start w:val="1"/>
+      <w:numFmt w:val="lowerLetter"/>
+      <w:lvlText w:val="%2."/>
+      <w:lvlJc w:val="left"/>
+      <w:pPr>
+        <w:ind w:left="1440" w:hanging="360"/>
+      </w:pPr>
+    </w:lvl>
+    <w:lvl w:ilvl="2" w:tplc="0409001B" w:tentative="1">
+      <w:start w:val="1"/>
+      <w:numFmt w:val="lowerRoman"/>
+      <w:lvlText w:val="%3."/>
+      <w:lvlJc w:val="right"/>
+      <w:pPr>
+        <w:ind w:left="2160" w:hanging="180"/>
+      </w:pPr>
+    </w:lvl>
+    <w:lvl w:ilvl="3" w:tplc="0409000F" w:tentative="1">
+      <w:start w:val="1"/>
+      <w:numFmt w:val="decimal"/>
+      <w:lvlText w:val="%4."/>
+      <w:lvlJc w:val="left"/>
+      <w:pPr>
+        <w:ind w:left="2880" w:hanging="360"/>
+      </w:pPr>
+    </w:lvl>
+    <w:lvl w:ilvl="4" w:tplc="04090019" w:tentative="1">
+      <w:start w:val="1"/>
+      <w:numFmt w:val="lowerLetter"/>
+      <w:lvlText w:val="%5."/>
+      <w:lvlJc w:val="left"/>
+      <w:pPr>
+        <w:ind w:left="3600" w:hanging="360"/>
+      </w:pPr>
+    </w:lvl>
+    <w:lvl w:ilvl="5" w:tplc="0409001B" w:tentative="1">
+      <w:start w:val="1"/>
+      <w:numFmt w:val="lowerRoman"/>
+      <w:lvlText w:val="%6."/>
+      <w:lvlJc w:val="right"/>
+      <w:pPr>
+        <w:ind w:left="4320" w:hanging="180"/>
+      </w:pPr>
+    </w:lvl>
+    <w:lvl w:ilvl="6" w:tplc="0409000F" w:tentative="1">
+      <w:start w:val="1"/>
+      <w:numFmt w:val="decimal"/>
+      <w:lvlText w:val="%7."/>
+      <w:lvlJc w:val="left"/>
+      <w:pPr>
+        <w:ind w:left="5040" w:hanging="360"/>
+      </w:pPr>
+    </w:lvl>
+    <w:lvl w:ilvl="7" w:tplc="04090019" w:tentative="1">
+      <w:start w:val="1"/>
+      <w:numFmt w:val="lowerLetter"/>
+      <w:lvlText w:val="%8."/>
+      <w:lvlJc w:val="left"/>
+      <w:pPr>
+        <w:ind w:left="5760" w:hanging="360"/>
+      </w:pPr>
+    </w:lvl>
+    <w:lvl w:ilvl="8" w:tplc="0409001B" w:tentative="1">
+      <w:start w:val="1"/>
+      <w:numFmt w:val="lowerRoman"/>
+      <w:lvlText w:val="%9."/>
+      <w:lvlJc w:val="right"/>
+      <w:pPr>
+        <w:ind w:left="6480" w:hanging="180"/>
+      </w:pPr>
+    </w:lvl>
+  </w:abstractNum>
   <w:num w:numId="1" w16cid:durableId="207647900">
     <w:abstractNumId w:val="0"/>
+  </w:num>
+  <w:num w:numId="2" w16cid:durableId="1444958954">
+    <w:abstractNumId w:val="1"/>
   </w:num>
 </w:numbering>
 </file>

</xml_diff>

<commit_message>
update incremental pr decoding
</commit_message>
<xml_diff>
--- a/decoding-analysis/revision_memos/meeting notes.docx
+++ b/decoding-analysis/revision_memos/meeting notes.docx
@@ -51,15 +51,7 @@
     </w:p>
     <w:p>
       <w:r>
-        <w:t xml:space="preserve">Geometric </w:t>
-      </w:r>
-      <w:proofErr w:type="gramStart"/>
-      <w:r>
-        <w:t>mean</w:t>
-      </w:r>
-      <w:proofErr w:type="gramEnd"/>
-      <w:r>
-        <w:t xml:space="preserve"> of means: product of two means</w:t>
+        <w:t>Geometric mean of means: product of two means</w:t>
       </w:r>
     </w:p>
     <w:p>
@@ -129,23 +121,7 @@
           <w:b/>
           <w:bCs/>
         </w:rPr>
-        <w:t xml:space="preserve">Variance and </w:t>
-      </w:r>
-      <w:proofErr w:type="gramStart"/>
-      <w:r>
-        <w:rPr>
-          <w:b/>
-          <w:bCs/>
-        </w:rPr>
-        <w:t>mean</w:t>
-      </w:r>
-      <w:proofErr w:type="gramEnd"/>
-      <w:r>
-        <w:rPr>
-          <w:b/>
-          <w:bCs/>
-        </w:rPr>
-        <w:t xml:space="preserve"> of noise correlation</w:t>
+        <w:t>Variance and mean of noise correlation</w:t>
       </w:r>
       <w:r>
         <w:rPr>
@@ -159,23 +135,7 @@
           <w:b/>
           <w:bCs/>
         </w:rPr>
-        <w:t xml:space="preserve">, you get a two-dimensional plot. Mean as x and variance as y. </w:t>
-      </w:r>
-      <w:proofErr w:type="gramStart"/>
-      <w:r>
-        <w:rPr>
-          <w:b/>
-          <w:bCs/>
-        </w:rPr>
-        <w:t>each</w:t>
-      </w:r>
-      <w:proofErr w:type="gramEnd"/>
-      <w:r>
-        <w:rPr>
-          <w:b/>
-          <w:bCs/>
-        </w:rPr>
-        <w:t xml:space="preserve"> point is one neuron</w:t>
+        <w:t>, you get a two-dimensional plot. Mean as x and variance as y. each point is one neuron</w:t>
       </w:r>
       <w:r>
         <w:rPr>
@@ -574,39 +534,7 @@
           <w:b/>
           <w:bCs/>
         </w:rPr>
-        <w:t xml:space="preserve">: </w:t>
-      </w:r>
-      <w:proofErr w:type="spellStart"/>
-      <w:r>
-        <w:rPr>
-          <w:b/>
-          <w:bCs/>
-        </w:rPr>
-        <w:t>stimPair</w:t>
-      </w:r>
-      <w:proofErr w:type="spellEnd"/>
-      <w:r>
-        <w:rPr>
-          <w:b/>
-          <w:bCs/>
-        </w:rPr>
-        <w:t xml:space="preserve"> wise or </w:t>
-      </w:r>
-      <w:proofErr w:type="gramStart"/>
-      <w:r>
-        <w:rPr>
-          <w:b/>
-          <w:bCs/>
-        </w:rPr>
-        <w:t>the all</w:t>
-      </w:r>
-      <w:proofErr w:type="gramEnd"/>
-      <w:r>
-        <w:rPr>
-          <w:b/>
-          <w:bCs/>
-        </w:rPr>
-        <w:t xml:space="preserve"> 50 stims</w:t>
+        <w:t>: stimPair wise or the all 50 stims</w:t>
       </w:r>
     </w:p>
     <w:p>
@@ -770,23 +698,7 @@
           <w:b/>
           <w:bCs/>
         </w:rPr>
-        <w:t xml:space="preserve"> in EC: what is the correlation? What is </w:t>
-      </w:r>
-      <w:proofErr w:type="gramStart"/>
-      <w:r>
-        <w:rPr>
-          <w:b/>
-          <w:bCs/>
-        </w:rPr>
-        <w:t>the null</w:t>
-      </w:r>
-      <w:proofErr w:type="gramEnd"/>
-      <w:r>
-        <w:rPr>
-          <w:b/>
-          <w:bCs/>
-        </w:rPr>
-        <w:t>?</w:t>
+        <w:t xml:space="preserve"> in EC: what is the correlation? What is the null?</w:t>
       </w:r>
     </w:p>
     <w:p>
@@ -1225,39 +1137,7 @@
           <w:b/>
           <w:bCs/>
         </w:rPr>
-        <w:t>Model 1</w:t>
-      </w:r>
-      <w:proofErr w:type="gramStart"/>
-      <w:r>
-        <w:rPr>
-          <w:b/>
-          <w:bCs/>
-        </w:rPr>
-        <w:t>:  each</w:t>
-      </w:r>
-      <w:proofErr w:type="gramEnd"/>
-      <w:r>
-        <w:rPr>
-          <w:b/>
-          <w:bCs/>
-        </w:rPr>
-        <w:t xml:space="preserve"> neuron has 50 random numbers for the 50 </w:t>
-      </w:r>
-      <w:proofErr w:type="gramStart"/>
-      <w:r>
-        <w:rPr>
-          <w:b/>
-          <w:bCs/>
-        </w:rPr>
-        <w:t>stimulus</w:t>
-      </w:r>
-      <w:proofErr w:type="gramEnd"/>
-      <w:r>
-        <w:rPr>
-          <w:b/>
-          <w:bCs/>
-        </w:rPr>
-        <w:t>, as mean responses.</w:t>
+        <w:t>Model 1:  each neuron has 50 random numbers for the 50 stimulus, as mean responses.</w:t>
       </w:r>
       <w:r>
         <w:rPr>
@@ -1265,25 +1145,7 @@
           <w:bCs/>
         </w:rPr>
         <w:cr/>
-        <w:t>Trial is generated by Poisson processes. You do self-</w:t>
-      </w:r>
-      <w:proofErr w:type="spellStart"/>
-      <w:proofErr w:type="gramStart"/>
-      <w:r>
-        <w:rPr>
-          <w:b/>
-          <w:bCs/>
-        </w:rPr>
-        <w:t>decodeing,should</w:t>
-      </w:r>
-      <w:proofErr w:type="spellEnd"/>
-      <w:proofErr w:type="gramEnd"/>
-      <w:r>
-        <w:rPr>
-          <w:b/>
-          <w:bCs/>
-        </w:rPr>
-        <w:t xml:space="preserve"> be very good. PT decoding should be chance.</w:t>
+        <w:t>Trial is generated by Poisson processes. You do self-decodeing,should be very good. PT decoding should be chance.</w:t>
       </w:r>
     </w:p>
     <w:p>
@@ -1329,39 +1191,7 @@
           <w:b/>
           <w:bCs/>
         </w:rPr>
-        <w:t xml:space="preserve">Model 3: we want to say </w:t>
-      </w:r>
-      <w:proofErr w:type="gramStart"/>
-      <w:r>
-        <w:rPr>
-          <w:b/>
-          <w:bCs/>
-        </w:rPr>
-        <w:t>W1,</w:t>
-      </w:r>
-      <w:proofErr w:type="gramEnd"/>
-      <w:r>
-        <w:rPr>
-          <w:b/>
-          <w:bCs/>
-        </w:rPr>
-        <w:t xml:space="preserve"> w2 are the same across all stimuli for a particular neuron, to </w:t>
-      </w:r>
-      <w:proofErr w:type="gramStart"/>
-      <w:r>
-        <w:rPr>
-          <w:b/>
-          <w:bCs/>
-        </w:rPr>
-        <w:t>represent  the</w:t>
-      </w:r>
-      <w:proofErr w:type="gramEnd"/>
-      <w:r>
-        <w:rPr>
-          <w:b/>
-          <w:bCs/>
-        </w:rPr>
-        <w:t xml:space="preserve"> SAME rendering. In this case, for AC, we have a 100 x (w1, w2) array, because they are the same for all stimuli in the same rendering. Similarly, EC also have a 100 x (w1, w2) array.</w:t>
+        <w:t>Model 3: we want to say W1, w2 are the same across all stimuli for a particular neuron, to represent  the SAME rendering. In this case, for AC, we have a 100 x (w1, w2) array, because they are the same for all stimuli in the same rendering. Similarly, EC also have a 100 x (w1, w2) array.</w:t>
       </w:r>
       <w:r>
         <w:rPr>
@@ -1406,165 +1236,53 @@
           <w:b/>
           <w:bCs/>
         </w:rPr>
-        <w:t xml:space="preserve">Model 5.  For all these models, maybe only need to consider two cues. But we need to consider EX is very different from AC and </w:t>
-      </w:r>
-      <w:proofErr w:type="gramStart"/>
-      <w:r>
-        <w:rPr>
-          <w:b/>
-          <w:bCs/>
-        </w:rPr>
-        <w:t>EC</w:t>
-      </w:r>
-      <w:proofErr w:type="gramEnd"/>
-      <w:r>
-        <w:rPr>
-          <w:b/>
-          <w:bCs/>
-        </w:rPr>
-        <w:t xml:space="preserve"> which have the same underlying variables. EX has extra variables, so you might want to consider EX’s response = w1 theta + w2 curvature + w3 complexity – to represent all kinds of distracting stimulus in EX real image examples.</w:t>
-      </w:r>
-    </w:p>
-    <w:p>
-      <w:pPr>
-        <w:rPr>
-          <w:b/>
-          <w:bCs/>
-        </w:rPr>
-      </w:pPr>
-    </w:p>
-    <w:p>
-      <w:pPr>
-        <w:rPr>
-          <w:b/>
-          <w:bCs/>
-        </w:rPr>
-      </w:pPr>
-      <w:r>
-        <w:rPr>
-          <w:b/>
-          <w:bCs/>
-        </w:rPr>
-        <w:t xml:space="preserve">Model 6: Model 2-4 are called linear mixed selectivity, which is what the reviewer suggested. But there is also a possibly of nonlinear mixed selectivity, we don’t have to do it but can also do it just to make us sound more sophisticated and that we </w:t>
-      </w:r>
-      <w:proofErr w:type="gramStart"/>
-      <w:r>
-        <w:rPr>
-          <w:b/>
-          <w:bCs/>
-        </w:rPr>
-        <w:t>actually consider</w:t>
-      </w:r>
-      <w:proofErr w:type="gramEnd"/>
-      <w:r>
-        <w:rPr>
-          <w:b/>
-          <w:bCs/>
-        </w:rPr>
-        <w:t xml:space="preserve"> the family of nonlinear mixed selectivity.  Now the response of the neuron is given </w:t>
-      </w:r>
-      <w:proofErr w:type="gramStart"/>
-      <w:r>
-        <w:rPr>
-          <w:b/>
-          <w:bCs/>
-        </w:rPr>
-        <w:t>by  w</w:t>
-      </w:r>
-      <w:proofErr w:type="gramEnd"/>
-      <w:r>
-        <w:rPr>
-          <w:b/>
-          <w:bCs/>
-        </w:rPr>
-        <w:t>1 theta + w2 curvature + w3 (theta x curvature).</w:t>
-      </w:r>
-    </w:p>
-    <w:p>
-      <w:pPr>
-        <w:rPr>
-          <w:b/>
-          <w:bCs/>
-        </w:rPr>
-      </w:pPr>
-    </w:p>
-    <w:p>
-      <w:pPr>
-        <w:rPr>
-          <w:b/>
-          <w:bCs/>
-        </w:rPr>
-      </w:pPr>
-      <w:r>
-        <w:rPr>
-          <w:b/>
-          <w:bCs/>
-        </w:rPr>
-        <w:t xml:space="preserve">Model 1 — null / independent means. </w:t>
-      </w:r>
-      <w:proofErr w:type="gramStart"/>
-      <w:r>
-        <w:rPr>
-          <w:b/>
-          <w:bCs/>
-        </w:rPr>
-        <w:t>μ_{</w:t>
-      </w:r>
-      <w:proofErr w:type="spellStart"/>
-      <w:r>
-        <w:rPr>
-          <w:b/>
-          <w:bCs/>
-        </w:rPr>
-        <w:t>i,c</w:t>
-      </w:r>
-      <w:proofErr w:type="gramEnd"/>
-      <w:r>
-        <w:rPr>
-          <w:b/>
-          <w:bCs/>
-        </w:rPr>
-        <w:t>,s</w:t>
-      </w:r>
-      <w:proofErr w:type="spellEnd"/>
-      <w:r>
-        <w:rPr>
-          <w:b/>
-          <w:bCs/>
-        </w:rPr>
-        <w:t xml:space="preserve">} drawn </w:t>
-      </w:r>
-      <w:proofErr w:type="spellStart"/>
-      <w:r>
-        <w:rPr>
-          <w:b/>
-          <w:bCs/>
-        </w:rPr>
-        <w:t>i.i.d.</w:t>
-      </w:r>
-      <w:proofErr w:type="spellEnd"/>
-      <w:r>
-        <w:rPr>
-          <w:b/>
-          <w:bCs/>
-        </w:rPr>
-        <w:t xml:space="preserve"> across neuron, cue, and stimulus (each stimulus is its own random pattern; equivalently </w:t>
-      </w:r>
-      <w:proofErr w:type="spellStart"/>
-      <w:r>
-        <w:rPr>
-          <w:b/>
-          <w:bCs/>
-        </w:rPr>
-        <w:t>W_c</w:t>
-      </w:r>
-      <w:proofErr w:type="spellEnd"/>
-      <w:r>
-        <w:rPr>
-          <w:b/>
-          <w:bCs/>
-        </w:rPr>
-        <w:t xml:space="preserve"> random with Φ = identity, </w:t>
+        <w:t>Model 5.  For all these models, maybe only need to consider two cues. But we need to consider EX is very different from AC and EC which have the same underlying variables. EX has extra variables, so you might want to consider EX’s response = w1 theta + w2 curvature + w3 complexity – to represent all kinds of distracting stimulus in EX real image examples.</w:t>
+      </w:r>
+    </w:p>
+    <w:p>
+      <w:pPr>
+        <w:rPr>
+          <w:b/>
+          <w:bCs/>
+        </w:rPr>
+      </w:pPr>
+    </w:p>
+    <w:p>
+      <w:pPr>
+        <w:rPr>
+          <w:b/>
+          <w:bCs/>
+        </w:rPr>
+      </w:pPr>
+      <w:r>
+        <w:rPr>
+          <w:b/>
+          <w:bCs/>
+        </w:rPr>
+        <w:t>Model 6: Model 2-4 are called linear mixed selectivity, which is what the reviewer suggested. But there is also a possibly of nonlinear mixed selectivity, we don’t have to do it but can also do it just to make us sound more sophisticated and that we actually consider the family of nonlinear mixed selectivity.  Now the response of the neuron is given by  w1 theta + w2 curvature + w3 (theta x curvature).</w:t>
+      </w:r>
+    </w:p>
+    <w:p>
+      <w:pPr>
+        <w:rPr>
+          <w:b/>
+          <w:bCs/>
+        </w:rPr>
+      </w:pPr>
+    </w:p>
+    <w:p>
+      <w:pPr>
+        <w:rPr>
+          <w:b/>
+          <w:bCs/>
+        </w:rPr>
+      </w:pPr>
+      <w:r>
+        <w:rPr>
+          <w:b/>
+          <w:bCs/>
+        </w:rPr>
+        <w:t xml:space="preserve">Model 1 — null / independent means. μ_{i,c,s} drawn i.i.d. across neuron, cue, and stimulus (each stimulus is its own random pattern; equivalently W_c random with Φ = identity, </w:t>
       </w:r>
       <w:r>
         <w:rPr>
@@ -1580,55 +1298,7 @@
           <w:b/>
           <w:bCs/>
         </w:rPr>
-        <w:t xml:space="preserve">). Self-decoding: high — 50 random patterns in N-D are near-orthogonal and trivially separable. PT: </w:t>
-      </w:r>
-      <w:proofErr w:type="gramStart"/>
-      <w:r>
-        <w:rPr>
-          <w:b/>
-          <w:bCs/>
-        </w:rPr>
-        <w:t>at</w:t>
-      </w:r>
-      <w:proofErr w:type="gramEnd"/>
-      <w:r>
-        <w:rPr>
-          <w:b/>
-          <w:bCs/>
-        </w:rPr>
-        <w:t xml:space="preserve"> chance — AC and EC clouds are independent random configurations, so no similarity </w:t>
-      </w:r>
-      <w:proofErr w:type="gramStart"/>
-      <w:r>
-        <w:rPr>
-          <w:b/>
-          <w:bCs/>
-        </w:rPr>
-        <w:t>transform</w:t>
-      </w:r>
-      <w:proofErr w:type="gramEnd"/>
-      <w:r>
-        <w:rPr>
-          <w:b/>
-          <w:bCs/>
-        </w:rPr>
-        <w:t xml:space="preserve"> maps stimulus s of AC onto s of EC. PR: large (≈ </w:t>
-      </w:r>
-      <w:proofErr w:type="gramStart"/>
-      <w:r>
-        <w:rPr>
-          <w:b/>
-          <w:bCs/>
-        </w:rPr>
-        <w:t>min(</w:t>
-      </w:r>
-      <w:proofErr w:type="gramEnd"/>
-      <w:r>
-        <w:rPr>
-          <w:b/>
-          <w:bCs/>
-        </w:rPr>
-        <w:t xml:space="preserve">N, S)). </w:t>
+        <w:t xml:space="preserve">). Self-decoding: high — 50 random patterns in N-D are near-orthogonal and trivially separable. PT: at chance — AC and EC clouds are independent random configurations, so no similarity transform maps stimulus s of AC onto s of EC. PR: large (≈ min(N, S)). </w:t>
       </w:r>
       <w:r>
         <w:rPr>
@@ -1637,9 +1307,189 @@
           <w:i/>
           <w:iCs/>
         </w:rPr>
-        <w:t>This is the reviewer's "</w:t>
-      </w:r>
-      <w:proofErr w:type="gramStart"/>
+        <w:t>This is the reviewer's "simplest case," and the point is to confirm PT fails so that PT working anywhere implies shared structure.</w:t>
+      </w:r>
+    </w:p>
+    <w:p>
+      <w:pPr>
+        <w:rPr>
+          <w:b/>
+          <w:bCs/>
+        </w:rPr>
+      </w:pPr>
+      <w:r>
+        <w:rPr>
+          <w:b/>
+          <w:bCs/>
+        </w:rPr>
+        <w:t>Model 2 — per-stimulus weights (degenerate). μ_{i,c,s} = w1_{i,c,s}·θ_s + w2_{i,c,s}·κ_s, with the weights drawn independently for every (neuron, cue, stimulus). Because each weight is multiplied by a fixed scalar (θ_s or κ_s), μ_{i,c,s} reduces to an independent random number per (i,c,s) — only its variance carries an s-dependence (</w:t>
+      </w:r>
+      <w:r>
+        <w:rPr>
+          <w:rFonts w:ascii="Cambria Math" w:hAnsi="Cambria Math" w:cs="Cambria Math"/>
+          <w:b/>
+          <w:bCs/>
+        </w:rPr>
+        <w:t>∝</w:t>
+      </w:r>
+      <w:r>
+        <w:rPr>
+          <w:b/>
+          <w:bCs/>
+        </w:rPr>
+        <w:t xml:space="preserve"> </w:t>
+      </w:r>
+      <w:r>
+        <w:rPr>
+          <w:rFonts w:ascii="Aptos" w:hAnsi="Aptos" w:cs="Aptos"/>
+          <w:b/>
+          <w:bCs/>
+        </w:rPr>
+        <w:t>θ</w:t>
+      </w:r>
+      <w:r>
+        <w:rPr>
+          <w:b/>
+          <w:bCs/>
+        </w:rPr>
+        <w:t>_s</w:t>
+      </w:r>
+      <w:r>
+        <w:rPr>
+          <w:rFonts w:ascii="Aptos" w:hAnsi="Aptos" w:cs="Aptos"/>
+          <w:b/>
+          <w:bCs/>
+        </w:rPr>
+        <w:t>²</w:t>
+      </w:r>
+      <w:r>
+        <w:rPr>
+          <w:b/>
+          <w:bCs/>
+        </w:rPr>
+        <w:t>+</w:t>
+      </w:r>
+      <w:r>
+        <w:rPr>
+          <w:rFonts w:ascii="Aptos" w:hAnsi="Aptos" w:cs="Aptos"/>
+          <w:b/>
+          <w:bCs/>
+        </w:rPr>
+        <w:t>κ</w:t>
+      </w:r>
+      <w:r>
+        <w:rPr>
+          <w:b/>
+          <w:bCs/>
+        </w:rPr>
+        <w:t>_s</w:t>
+      </w:r>
+      <w:r>
+        <w:rPr>
+          <w:rFonts w:ascii="Aptos" w:hAnsi="Aptos" w:cs="Aptos"/>
+          <w:b/>
+          <w:bCs/>
+        </w:rPr>
+        <w:t>²</w:t>
+      </w:r>
+      <w:r>
+        <w:rPr>
+          <w:b/>
+          <w:bCs/>
+        </w:rPr>
+        <w:t>). This is algebraically Model 1. Self high, PT chance. Sharing θ_s, κ_s buys nothing here because per-stimulus weights destroy any cross-cue correspondence. Worth flagging: if your notes intended this as a genuine "linear mixed selectivity" test, it is not one — the per-stimulus weighting is what kills it, which is exactly the contrast that motivates Model 3.</w:t>
+      </w:r>
+    </w:p>
+    <w:p>
+      <w:pPr>
+        <w:rPr>
+          <w:b/>
+          <w:bCs/>
+        </w:rPr>
+      </w:pPr>
+      <w:r>
+        <w:rPr>
+          <w:b/>
+          <w:bCs/>
+        </w:rPr>
+        <w:t xml:space="preserve">Model 3 — linear mixed selectivity (the reviewer's "interesting" case). Weights are fixed across stimuli, random per neuron and per cue: μ_{·,c} = W_c·[θ; κ], W_c </w:t>
+      </w:r>
+      <w:r>
+        <w:rPr>
+          <w:rFonts w:ascii="Cambria Math" w:hAnsi="Cambria Math" w:cs="Cambria Math"/>
+          <w:b/>
+          <w:bCs/>
+        </w:rPr>
+        <w:t>∈</w:t>
+      </w:r>
+      <w:r>
+        <w:rPr>
+          <w:b/>
+          <w:bCs/>
+        </w:rPr>
+        <w:t xml:space="preserve"> </w:t>
+      </w:r>
+      <w:r>
+        <w:rPr>
+          <w:rFonts w:ascii="Cambria Math" w:hAnsi="Cambria Math" w:cs="Cambria Math"/>
+          <w:b/>
+          <w:bCs/>
+        </w:rPr>
+        <w:lastRenderedPageBreak/>
+        <w:t>ℝ</w:t>
+      </w:r>
+      <w:r>
+        <w:rPr>
+          <w:b/>
+          <w:bCs/>
+        </w:rPr>
+        <w:t>^{N</w:t>
+      </w:r>
+      <w:r>
+        <w:rPr>
+          <w:rFonts w:ascii="Aptos" w:hAnsi="Aptos" w:cs="Aptos"/>
+          <w:b/>
+          <w:bCs/>
+        </w:rPr>
+        <w:t>×</w:t>
+      </w:r>
+      <w:r>
+        <w:rPr>
+          <w:b/>
+          <w:bCs/>
+        </w:rPr>
+        <w:t>2}, with [</w:t>
+      </w:r>
+      <w:r>
+        <w:rPr>
+          <w:rFonts w:ascii="Aptos" w:hAnsi="Aptos" w:cs="Aptos"/>
+          <w:b/>
+          <w:bCs/>
+        </w:rPr>
+        <w:t>θ</w:t>
+      </w:r>
+      <w:r>
+        <w:rPr>
+          <w:b/>
+          <w:bCs/>
+        </w:rPr>
+        <w:t xml:space="preserve">; </w:t>
+      </w:r>
+      <w:r>
+        <w:rPr>
+          <w:rFonts w:ascii="Aptos" w:hAnsi="Aptos" w:cs="Aptos"/>
+          <w:b/>
+          <w:bCs/>
+        </w:rPr>
+        <w:t>κ</w:t>
+      </w:r>
+      <w:r>
+        <w:rPr>
+          <w:b/>
+          <w:bCs/>
+        </w:rPr>
+        <w:t xml:space="preserve">] shared. Each cue is a </w:t>
+      </w:r>
       <w:r>
         <w:rPr>
           <w:b/>
@@ -1647,9 +1497,38 @@
           <w:i/>
           <w:iCs/>
         </w:rPr>
-        <w:t>simplest</w:t>
-      </w:r>
-      <w:proofErr w:type="gramEnd"/>
+        <w:t>linear image of the same 2-D shape configuration</w:t>
+      </w:r>
+      <w:r>
+        <w:rPr>
+          <w:b/>
+          <w:bCs/>
+        </w:rPr>
+        <w:t>, so rank = 2 and PR ≈ 2. Self-decoding: good but capped by the 2-D bottleneck plus Poisson noise (neighboring (θ,κ) stimuli get confused), not the near-ceiling of Model 1. PT: above chance but generally partial, and the level is set by how W_AC and W_EC relate — this is the subtlety. With independent random W per cue, the intrinsic map between renderings is a general 2×2 matrix B_EC B_AC</w:t>
+      </w:r>
+      <w:r>
+        <w:rPr>
+          <w:rFonts w:ascii="Cambria Math" w:hAnsi="Cambria Math" w:cs="Cambria Math"/>
+          <w:b/>
+          <w:bCs/>
+        </w:rPr>
+        <w:t>⁻</w:t>
+      </w:r>
+      <w:r>
+        <w:rPr>
+          <w:rFonts w:ascii="Aptos" w:hAnsi="Aptos" w:cs="Aptos"/>
+          <w:b/>
+          <w:bCs/>
+        </w:rPr>
+        <w:t>¹</w:t>
+      </w:r>
+      <w:r>
+        <w:rPr>
+          <w:b/>
+          <w:bCs/>
+        </w:rPr>
+        <w:t xml:space="preserve"> that includes shear/anisotropy; similarity Procrustes can align the two 2-D subspaces and apply a 2-D rotation+scale, but it </w:t>
+      </w:r>
       <w:r>
         <w:rPr>
           <w:b/>
@@ -1657,250 +1536,14 @@
           <w:i/>
           <w:iCs/>
         </w:rPr>
-        <w:t xml:space="preserve"> case," and the point is to confirm PT fails so that PT working anywhere implies shared structure.</w:t>
-      </w:r>
-    </w:p>
-    <w:p>
-      <w:pPr>
-        <w:rPr>
-          <w:b/>
-          <w:bCs/>
-        </w:rPr>
-      </w:pPr>
-      <w:r>
-        <w:rPr>
-          <w:b/>
-          <w:bCs/>
-        </w:rPr>
-        <w:t xml:space="preserve">Model 2 — per-stimulus weights (degenerate). </w:t>
-      </w:r>
-      <w:proofErr w:type="gramStart"/>
-      <w:r>
-        <w:rPr>
-          <w:b/>
-          <w:bCs/>
-        </w:rPr>
-        <w:t>μ_{</w:t>
-      </w:r>
-      <w:proofErr w:type="spellStart"/>
-      <w:r>
-        <w:rPr>
-          <w:b/>
-          <w:bCs/>
-        </w:rPr>
-        <w:t>i,c</w:t>
-      </w:r>
-      <w:proofErr w:type="gramEnd"/>
-      <w:r>
-        <w:rPr>
-          <w:b/>
-          <w:bCs/>
-        </w:rPr>
-        <w:t>,s</w:t>
-      </w:r>
-      <w:proofErr w:type="spellEnd"/>
-      <w:r>
-        <w:rPr>
-          <w:b/>
-          <w:bCs/>
-        </w:rPr>
-        <w:t xml:space="preserve">} = </w:t>
-      </w:r>
-      <w:proofErr w:type="gramStart"/>
-      <w:r>
-        <w:rPr>
-          <w:b/>
-          <w:bCs/>
-        </w:rPr>
-        <w:t>w1_{</w:t>
-      </w:r>
-      <w:proofErr w:type="spellStart"/>
-      <w:r>
-        <w:rPr>
-          <w:b/>
-          <w:bCs/>
-        </w:rPr>
-        <w:t>i,c</w:t>
-      </w:r>
-      <w:proofErr w:type="gramEnd"/>
-      <w:r>
-        <w:rPr>
-          <w:b/>
-          <w:bCs/>
-        </w:rPr>
-        <w:t>,</w:t>
-      </w:r>
-      <w:proofErr w:type="gramStart"/>
-      <w:r>
-        <w:rPr>
-          <w:b/>
-          <w:bCs/>
-        </w:rPr>
-        <w:t>s</w:t>
-      </w:r>
-      <w:proofErr w:type="spellEnd"/>
-      <w:r>
-        <w:rPr>
-          <w:b/>
-          <w:bCs/>
-        </w:rPr>
-        <w:t>}·</w:t>
-      </w:r>
-      <w:proofErr w:type="spellStart"/>
-      <w:proofErr w:type="gramEnd"/>
-      <w:r>
-        <w:rPr>
-          <w:b/>
-          <w:bCs/>
-        </w:rPr>
-        <w:t>θ_s</w:t>
-      </w:r>
-      <w:proofErr w:type="spellEnd"/>
-      <w:r>
-        <w:rPr>
-          <w:b/>
-          <w:bCs/>
-        </w:rPr>
-        <w:t xml:space="preserve"> + </w:t>
-      </w:r>
-      <w:proofErr w:type="gramStart"/>
-      <w:r>
-        <w:rPr>
-          <w:b/>
-          <w:bCs/>
-        </w:rPr>
-        <w:t>w2_{</w:t>
-      </w:r>
-      <w:proofErr w:type="spellStart"/>
-      <w:r>
-        <w:rPr>
-          <w:b/>
-          <w:bCs/>
-        </w:rPr>
-        <w:t>i,c</w:t>
-      </w:r>
-      <w:proofErr w:type="gramEnd"/>
-      <w:r>
-        <w:rPr>
-          <w:b/>
-          <w:bCs/>
-        </w:rPr>
-        <w:t>,</w:t>
-      </w:r>
-      <w:proofErr w:type="gramStart"/>
-      <w:r>
-        <w:rPr>
-          <w:b/>
-          <w:bCs/>
-        </w:rPr>
-        <w:t>s</w:t>
-      </w:r>
-      <w:proofErr w:type="spellEnd"/>
-      <w:r>
-        <w:rPr>
-          <w:b/>
-          <w:bCs/>
-        </w:rPr>
-        <w:t>}·</w:t>
-      </w:r>
-      <w:proofErr w:type="spellStart"/>
-      <w:proofErr w:type="gramEnd"/>
-      <w:r>
-        <w:rPr>
-          <w:b/>
-          <w:bCs/>
-        </w:rPr>
-        <w:t>κ_s</w:t>
-      </w:r>
-      <w:proofErr w:type="spellEnd"/>
-      <w:r>
-        <w:rPr>
-          <w:b/>
-          <w:bCs/>
-        </w:rPr>
-        <w:t>, with the weights drawn independently for every (neuron, cue, stimulus). Because each weight is multiplied by a fixed scalar (</w:t>
-      </w:r>
-      <w:proofErr w:type="spellStart"/>
-      <w:r>
-        <w:rPr>
-          <w:b/>
-          <w:bCs/>
-        </w:rPr>
-        <w:t>θ_s</w:t>
-      </w:r>
-      <w:proofErr w:type="spellEnd"/>
-      <w:r>
-        <w:rPr>
-          <w:b/>
-          <w:bCs/>
-        </w:rPr>
-        <w:t xml:space="preserve"> or </w:t>
-      </w:r>
-      <w:proofErr w:type="spellStart"/>
-      <w:r>
-        <w:rPr>
-          <w:b/>
-          <w:bCs/>
-        </w:rPr>
-        <w:t>κ_s</w:t>
-      </w:r>
-      <w:proofErr w:type="spellEnd"/>
-      <w:r>
-        <w:rPr>
-          <w:b/>
-          <w:bCs/>
-        </w:rPr>
-        <w:t>), μ_{</w:t>
-      </w:r>
-      <w:proofErr w:type="spellStart"/>
-      <w:proofErr w:type="gramStart"/>
-      <w:r>
-        <w:rPr>
-          <w:b/>
-          <w:bCs/>
-        </w:rPr>
-        <w:t>i,c</w:t>
-      </w:r>
-      <w:proofErr w:type="gramEnd"/>
-      <w:r>
-        <w:rPr>
-          <w:b/>
-          <w:bCs/>
-        </w:rPr>
-        <w:t>,s</w:t>
-      </w:r>
-      <w:proofErr w:type="spellEnd"/>
-      <w:r>
-        <w:rPr>
-          <w:b/>
-          <w:bCs/>
-        </w:rPr>
-        <w:t>} reduces to an independent random number per (</w:t>
-      </w:r>
-      <w:proofErr w:type="spellStart"/>
-      <w:proofErr w:type="gramStart"/>
-      <w:r>
-        <w:rPr>
-          <w:b/>
-          <w:bCs/>
-        </w:rPr>
-        <w:t>i,c</w:t>
-      </w:r>
-      <w:proofErr w:type="gramEnd"/>
-      <w:r>
-        <w:rPr>
-          <w:b/>
-          <w:bCs/>
-        </w:rPr>
-        <w:t>,s</w:t>
-      </w:r>
-      <w:proofErr w:type="spellEnd"/>
-      <w:r>
-        <w:rPr>
-          <w:b/>
-          <w:bCs/>
-        </w:rPr>
-        <w:t>) — only its variance carries an s-dependence (</w:t>
+        <w:t>cannot</w:t>
+      </w:r>
+      <w:r>
+        <w:rPr>
+          <w:b/>
+          <w:bCs/>
+        </w:rPr>
+        <w:t xml:space="preserve"> remove that anisotropy, so a residual distortion remains and PT lands between chance and ceiling. To get clean transfer you must constrain the cross-cue readout (e.g. W_EC = s·O·W_AC for orthogonal O </w:t>
       </w:r>
       <w:r>
         <w:rPr>
@@ -1908,194 +1551,14 @@
           <w:b/>
           <w:bCs/>
         </w:rPr>
-        <w:t>∝</w:t>
-      </w:r>
-      <w:r>
-        <w:rPr>
-          <w:b/>
-          <w:bCs/>
-        </w:rPr>
-        <w:t xml:space="preserve"> </w:t>
-      </w:r>
-      <w:r>
-        <w:rPr>
-          <w:rFonts w:ascii="Aptos" w:hAnsi="Aptos" w:cs="Aptos"/>
-          <w:b/>
-          <w:bCs/>
-        </w:rPr>
-        <w:t>θ</w:t>
-      </w:r>
-      <w:r>
-        <w:rPr>
-          <w:b/>
-          <w:bCs/>
-        </w:rPr>
-        <w:t>_s</w:t>
-      </w:r>
-      <w:r>
-        <w:rPr>
-          <w:rFonts w:ascii="Aptos" w:hAnsi="Aptos" w:cs="Aptos"/>
-          <w:b/>
-          <w:bCs/>
-        </w:rPr>
-        <w:t>²</w:t>
-      </w:r>
-      <w:r>
-        <w:rPr>
-          <w:b/>
-          <w:bCs/>
-        </w:rPr>
-        <w:t>+</w:t>
-      </w:r>
-      <w:r>
-        <w:rPr>
-          <w:rFonts w:ascii="Aptos" w:hAnsi="Aptos" w:cs="Aptos"/>
-          <w:b/>
-          <w:bCs/>
-        </w:rPr>
-        <w:t>κ</w:t>
-      </w:r>
-      <w:r>
-        <w:rPr>
-          <w:b/>
-          <w:bCs/>
-        </w:rPr>
-        <w:t>_s</w:t>
-      </w:r>
-      <w:r>
-        <w:rPr>
-          <w:rFonts w:ascii="Aptos" w:hAnsi="Aptos" w:cs="Aptos"/>
-          <w:b/>
-          <w:bCs/>
-        </w:rPr>
-        <w:t>²</w:t>
-      </w:r>
-      <w:r>
-        <w:rPr>
-          <w:b/>
-          <w:bCs/>
-        </w:rPr>
-        <w:t xml:space="preserve">). This is algebraically Model 1. </w:t>
-      </w:r>
-      <w:proofErr w:type="spellStart"/>
-      <w:r>
-        <w:rPr>
-          <w:b/>
-          <w:bCs/>
-        </w:rPr>
-        <w:t>Self high</w:t>
-      </w:r>
-      <w:proofErr w:type="spellEnd"/>
-      <w:r>
-        <w:rPr>
-          <w:b/>
-          <w:bCs/>
-        </w:rPr>
-        <w:t xml:space="preserve">, PT chance. Sharing </w:t>
-      </w:r>
-      <w:proofErr w:type="spellStart"/>
-      <w:r>
-        <w:rPr>
-          <w:b/>
-          <w:bCs/>
-        </w:rPr>
-        <w:t>θ_s</w:t>
-      </w:r>
-      <w:proofErr w:type="spellEnd"/>
-      <w:r>
-        <w:rPr>
-          <w:b/>
-          <w:bCs/>
-        </w:rPr>
-        <w:t xml:space="preserve">, </w:t>
-      </w:r>
-      <w:proofErr w:type="spellStart"/>
-      <w:r>
-        <w:rPr>
-          <w:b/>
-          <w:bCs/>
-        </w:rPr>
-        <w:t>κ_s</w:t>
-      </w:r>
-      <w:proofErr w:type="spellEnd"/>
-      <w:r>
-        <w:rPr>
-          <w:b/>
-          <w:bCs/>
-        </w:rPr>
-        <w:t xml:space="preserve"> buys nothing here because per-stimulus weights destroy any cross-cue correspondence. Worth flagging: if your notes intended this as a genuine "linear mixed selectivity" test, it is not one — the per-stimulus weighting is what kills it, which is exactly the contrast that motivates Model 3.</w:t>
-      </w:r>
-    </w:p>
-    <w:p>
-      <w:pPr>
-        <w:rPr>
-          <w:b/>
-          <w:bCs/>
-        </w:rPr>
-      </w:pPr>
-      <w:r>
-        <w:rPr>
-          <w:b/>
-          <w:bCs/>
-        </w:rPr>
-        <w:t>Model 3 — linear mixed selectivity (the reviewer's "interesting" case). Weights are fixed across stimuli, random per neuron and per cue: μ_{</w:t>
-      </w:r>
-      <w:proofErr w:type="gramStart"/>
-      <w:r>
-        <w:rPr>
-          <w:b/>
-          <w:bCs/>
-        </w:rPr>
-        <w:t>·,c</w:t>
-      </w:r>
-      <w:proofErr w:type="gramEnd"/>
-      <w:r>
-        <w:rPr>
-          <w:b/>
-          <w:bCs/>
-        </w:rPr>
-        <w:t xml:space="preserve">} = </w:t>
-      </w:r>
-      <w:proofErr w:type="spellStart"/>
-      <w:r>
-        <w:rPr>
-          <w:b/>
-          <w:bCs/>
-        </w:rPr>
-        <w:t>W_c</w:t>
-      </w:r>
-      <w:proofErr w:type="spellEnd"/>
-      <w:proofErr w:type="gramStart"/>
-      <w:r>
-        <w:rPr>
-          <w:b/>
-          <w:bCs/>
-        </w:rPr>
-        <w:t>·[</w:t>
-      </w:r>
-      <w:proofErr w:type="gramEnd"/>
-      <w:r>
-        <w:rPr>
-          <w:b/>
-          <w:bCs/>
-        </w:rPr>
-        <w:t xml:space="preserve">θ; κ], </w:t>
-      </w:r>
-      <w:proofErr w:type="spellStart"/>
-      <w:r>
-        <w:rPr>
-          <w:b/>
-          <w:bCs/>
-        </w:rPr>
-        <w:t>W_c</w:t>
-      </w:r>
-      <w:proofErr w:type="spellEnd"/>
-      <w:r>
-        <w:rPr>
-          <w:b/>
-          <w:bCs/>
-        </w:rPr>
-        <w:t xml:space="preserve"> </w:t>
+        <w:t>⇒</w:t>
+      </w:r>
+      <w:r>
+        <w:rPr>
+          <w:b/>
+          <w:bCs/>
+        </w:rPr>
+        <w:t xml:space="preserve"> PT near ceiling). So "Model 3 </w:t>
       </w:r>
       <w:r>
         <w:rPr>
@@ -2103,75 +1566,14 @@
           <w:b/>
           <w:bCs/>
         </w:rPr>
-        <w:t>∈</w:t>
-      </w:r>
-      <w:r>
-        <w:rPr>
-          <w:b/>
-          <w:bCs/>
-        </w:rPr>
-        <w:t xml:space="preserve"> </w:t>
-      </w:r>
-      <w:r>
-        <w:rPr>
-          <w:rFonts w:ascii="Cambria Math" w:hAnsi="Cambria Math" w:cs="Cambria Math"/>
-          <w:b/>
-          <w:bCs/>
-        </w:rPr>
-        <w:lastRenderedPageBreak/>
-        <w:t>ℝ</w:t>
-      </w:r>
-      <w:r>
-        <w:rPr>
-          <w:b/>
-          <w:bCs/>
-        </w:rPr>
-        <w:t>^{N</w:t>
-      </w:r>
-      <w:r>
-        <w:rPr>
-          <w:rFonts w:ascii="Aptos" w:hAnsi="Aptos" w:cs="Aptos"/>
-          <w:b/>
-          <w:bCs/>
-        </w:rPr>
-        <w:t>×</w:t>
-      </w:r>
-      <w:r>
-        <w:rPr>
-          <w:b/>
-          <w:bCs/>
-        </w:rPr>
-        <w:t>2}, with [</w:t>
-      </w:r>
-      <w:r>
-        <w:rPr>
-          <w:rFonts w:ascii="Aptos" w:hAnsi="Aptos" w:cs="Aptos"/>
-          <w:b/>
-          <w:bCs/>
-        </w:rPr>
-        <w:t>θ</w:t>
-      </w:r>
-      <w:r>
-        <w:rPr>
-          <w:b/>
-          <w:bCs/>
-        </w:rPr>
-        <w:t xml:space="preserve">; </w:t>
-      </w:r>
-      <w:r>
-        <w:rPr>
-          <w:rFonts w:ascii="Aptos" w:hAnsi="Aptos" w:cs="Aptos"/>
-          <w:b/>
-          <w:bCs/>
-        </w:rPr>
-        <w:t>κ</w:t>
-      </w:r>
-      <w:r>
-        <w:rPr>
-          <w:b/>
-          <w:bCs/>
-        </w:rPr>
-        <w:t xml:space="preserve">] shared. Each cue is a </w:t>
+        <w:t>⇒</w:t>
+      </w:r>
+      <w:r>
+        <w:rPr>
+          <w:b/>
+          <w:bCs/>
+        </w:rPr>
+        <w:t xml:space="preserve"> PT works" is true only up to this knob; the literal "all random for AC, all random for EC" will likely give </w:t>
       </w:r>
       <w:r>
         <w:rPr>
@@ -2180,32 +1582,44 @@
           <w:i/>
           <w:iCs/>
         </w:rPr>
-        <w:t>linear image of the same 2-D shape configuration</w:t>
-      </w:r>
-      <w:r>
-        <w:rPr>
-          <w:b/>
-          <w:bCs/>
-        </w:rPr>
-        <w:t>, so rank = 2 and PR ≈ 2. Self-decoding: good but capped by the 2-D bottleneck plus Poisson noise (neighboring (</w:t>
-      </w:r>
-      <w:proofErr w:type="spellStart"/>
-      <w:proofErr w:type="gramStart"/>
-      <w:r>
-        <w:rPr>
-          <w:b/>
-          <w:bCs/>
-        </w:rPr>
-        <w:t>θ,κ</w:t>
-      </w:r>
-      <w:proofErr w:type="spellEnd"/>
-      <w:proofErr w:type="gramEnd"/>
-      <w:r>
-        <w:rPr>
-          <w:b/>
-          <w:bCs/>
-        </w:rPr>
-        <w:t>) stimuli get confused), not the near-ceiling of Model 1. PT: above chance but generally partial, and the level is set by how W_AC and W_EC relate — this is the subtlety. With independent random W per cue, the intrinsic map between renderings is a general 2×2 matrix B_EC B_AC</w:t>
+        <w:t>intermediate</w:t>
+      </w:r>
+      <w:r>
+        <w:rPr>
+          <w:b/>
+          <w:bCs/>
+        </w:rPr>
+        <w:t xml:space="preserve"> PT.</w:t>
+      </w:r>
+    </w:p>
+    <w:p>
+      <w:pPr>
+        <w:rPr>
+          <w:b/>
+          <w:bCs/>
+        </w:rPr>
+      </w:pPr>
+      <w:r>
+        <w:rPr>
+          <w:b/>
+          <w:bCs/>
+        </w:rPr>
+        <w:t>Model 4 — transpose/symmetry variant (redundant). The senior author's symmetry argument is the bilinear factorization M_c = W_c·Φ being symmetric in its two factors: putting cue-invariance in Φ with cue-variation in W (Model 3) is statistically equivalent, under a neuron↔stimulus relabeling, to the flipped assignment — so Model 4 adds nothing and need not be run. One caution: as literally transcribed ("same W for all neurons, W differs across stimuli"), the response stops depending on neuron index and the population becomes rank-1 (all neurons identical), which is degenerate rather than equivalent to Model 3. Please confirm the intended statement is the factorization-symmetry point and not the verbatim one.</w:t>
+      </w:r>
+    </w:p>
+    <w:p>
+      <w:pPr>
+        <w:rPr>
+          <w:b/>
+          <w:bCs/>
+        </w:rPr>
+      </w:pPr>
+      <w:r>
+        <w:rPr>
+          <w:b/>
+          <w:bCs/>
+        </w:rPr>
+        <w:t xml:space="preserve">Model 5 — EX with an extra latent. AC and EC are Model 3 (shared θ, κ; rank 2). EX gets an additional EX-only variable ψ_s ("complexity"/distractor): μ_{·,EX} = W_EX·[θ; κ; ψ], W_EX </w:t>
       </w:r>
       <w:r>
         <w:rPr>
@@ -2213,7 +1627,29 @@
           <w:b/>
           <w:bCs/>
         </w:rPr>
-        <w:t>⁻</w:t>
+        <w:t>∈</w:t>
+      </w:r>
+      <w:r>
+        <w:rPr>
+          <w:b/>
+          <w:bCs/>
+        </w:rPr>
+        <w:t xml:space="preserve"> </w:t>
+      </w:r>
+      <w:r>
+        <w:rPr>
+          <w:rFonts w:ascii="Cambria Math" w:hAnsi="Cambria Math" w:cs="Cambria Math"/>
+          <w:b/>
+          <w:bCs/>
+        </w:rPr>
+        <w:t>ℝ</w:t>
+      </w:r>
+      <w:r>
+        <w:rPr>
+          <w:b/>
+          <w:bCs/>
+        </w:rPr>
+        <w:t>^{N</w:t>
       </w:r>
       <w:r>
         <w:rPr>
@@ -2221,62 +1657,59 @@
           <w:b/>
           <w:bCs/>
         </w:rPr>
-        <w:t>¹</w:t>
-      </w:r>
-      <w:r>
-        <w:rPr>
-          <w:b/>
-          <w:bCs/>
-        </w:rPr>
-        <w:t xml:space="preserve"> that includes shear/anisotropy; similarity Procrustes can align the two 2-D subspaces and apply a 2-D </w:t>
-      </w:r>
-      <w:proofErr w:type="spellStart"/>
-      <w:r>
-        <w:rPr>
-          <w:b/>
-          <w:bCs/>
-        </w:rPr>
-        <w:t>rotation+scale</w:t>
-      </w:r>
-      <w:proofErr w:type="spellEnd"/>
-      <w:r>
-        <w:rPr>
-          <w:b/>
-          <w:bCs/>
-        </w:rPr>
-        <w:t xml:space="preserve">, but it </w:t>
-      </w:r>
-      <w:r>
-        <w:rPr>
-          <w:b/>
-          <w:bCs/>
-          <w:i/>
-          <w:iCs/>
-        </w:rPr>
-        <w:t>cannot</w:t>
-      </w:r>
-      <w:r>
-        <w:rPr>
-          <w:b/>
-          <w:bCs/>
-        </w:rPr>
-        <w:t xml:space="preserve"> remove that anisotropy, so a residual distortion remains and PT lands between chance and ceiling. To get clean transfer you must constrain the cross-cue readout (e.g. W_EC = </w:t>
-      </w:r>
-      <w:proofErr w:type="spellStart"/>
-      <w:r>
-        <w:rPr>
-          <w:b/>
-          <w:bCs/>
-        </w:rPr>
-        <w:t>s·O·W_AC</w:t>
-      </w:r>
-      <w:proofErr w:type="spellEnd"/>
-      <w:r>
-        <w:rPr>
-          <w:b/>
-          <w:bCs/>
-        </w:rPr>
-        <w:t xml:space="preserve"> for orthogonal O </w:t>
+        <w:t>×</w:t>
+      </w:r>
+      <w:r>
+        <w:rPr>
+          <w:b/>
+          <w:bCs/>
+        </w:rPr>
+        <w:t>3}, rank 3, PR_EX &gt; PR_{AC,EC}. AC</w:t>
+      </w:r>
+      <w:r>
+        <w:rPr>
+          <w:rFonts w:ascii="Aptos" w:hAnsi="Aptos" w:cs="Aptos"/>
+          <w:b/>
+          <w:bCs/>
+        </w:rPr>
+        <w:t>↔</w:t>
+      </w:r>
+      <w:r>
+        <w:rPr>
+          <w:b/>
+          <w:bCs/>
+        </w:rPr>
+        <w:t>EC PT works as in Model 3; AC/EC</w:t>
+      </w:r>
+      <w:r>
+        <w:rPr>
+          <w:rFonts w:ascii="Aptos" w:hAnsi="Aptos" w:cs="Aptos"/>
+          <w:b/>
+          <w:bCs/>
+        </w:rPr>
+        <w:t>↔</w:t>
+      </w:r>
+      <w:r>
+        <w:rPr>
+          <w:b/>
+          <w:bCs/>
+        </w:rPr>
+        <w:t>EX PT is partial — the shared (θ,κ) plane transfers, but the ψ axis has no counterpart in AC/EC and acts as non-transferable scatter, degrading transfer in proportion to ψ's variance share. This matches the empirical intuition that EX is "very different" and carries extra image structure. Design choice: whether ψ is independent of (θ,κ) (pure orthogonal nuisance) or correlated with them.</w:t>
+      </w:r>
+    </w:p>
+    <w:p>
+      <w:pPr>
+        <w:rPr>
+          <w:b/>
+          <w:bCs/>
+        </w:rPr>
+      </w:pPr>
+      <w:r>
+        <w:rPr>
+          <w:b/>
+          <w:bCs/>
+        </w:rPr>
+        <w:t>Model 6 — nonlinear mixed selectivity. μ_{·,c} = W_c·[θ; κ; θ</w:t>
       </w:r>
       <w:r>
         <w:rPr>
@@ -2284,201 +1717,7 @@
           <w:b/>
           <w:bCs/>
         </w:rPr>
-        <w:t>⇒</w:t>
-      </w:r>
-      <w:r>
-        <w:rPr>
-          <w:b/>
-          <w:bCs/>
-        </w:rPr>
-        <w:t xml:space="preserve"> PT near ceiling). So "Model 3 </w:t>
-      </w:r>
-      <w:r>
-        <w:rPr>
-          <w:rFonts w:ascii="Cambria Math" w:hAnsi="Cambria Math" w:cs="Cambria Math"/>
-          <w:b/>
-          <w:bCs/>
-        </w:rPr>
-        <w:t>⇒</w:t>
-      </w:r>
-      <w:r>
-        <w:rPr>
-          <w:b/>
-          <w:bCs/>
-        </w:rPr>
-        <w:t xml:space="preserve"> PT works" is true only up to this knob; the literal "all random for AC, all random for EC" will likely give </w:t>
-      </w:r>
-      <w:r>
-        <w:rPr>
-          <w:b/>
-          <w:bCs/>
-          <w:i/>
-          <w:iCs/>
-        </w:rPr>
-        <w:t>intermediate</w:t>
-      </w:r>
-      <w:r>
-        <w:rPr>
-          <w:b/>
-          <w:bCs/>
-        </w:rPr>
-        <w:t xml:space="preserve"> PT.</w:t>
-      </w:r>
-    </w:p>
-    <w:p>
-      <w:pPr>
-        <w:rPr>
-          <w:b/>
-          <w:bCs/>
-        </w:rPr>
-      </w:pPr>
-      <w:r>
-        <w:rPr>
-          <w:b/>
-          <w:bCs/>
-        </w:rPr>
-        <w:t xml:space="preserve">Model 4 — transpose/symmetry variant (redundant). The senior author's symmetry argument is the bilinear factorization </w:t>
-      </w:r>
-      <w:proofErr w:type="spellStart"/>
-      <w:r>
-        <w:rPr>
-          <w:b/>
-          <w:bCs/>
-        </w:rPr>
-        <w:t>M_c</w:t>
-      </w:r>
-      <w:proofErr w:type="spellEnd"/>
-      <w:r>
-        <w:rPr>
-          <w:b/>
-          <w:bCs/>
-        </w:rPr>
-        <w:t xml:space="preserve"> = </w:t>
-      </w:r>
-      <w:proofErr w:type="spellStart"/>
-      <w:r>
-        <w:rPr>
-          <w:b/>
-          <w:bCs/>
-        </w:rPr>
-        <w:t>W_c·Φ</w:t>
-      </w:r>
-      <w:proofErr w:type="spellEnd"/>
-      <w:r>
-        <w:rPr>
-          <w:b/>
-          <w:bCs/>
-        </w:rPr>
-        <w:t xml:space="preserve"> being symmetric in its two factors: putting cue-invariance in Φ with cue-variation in W (Model 3) is statistically equivalent, under a </w:t>
-      </w:r>
-      <w:proofErr w:type="spellStart"/>
-      <w:r>
-        <w:rPr>
-          <w:b/>
-          <w:bCs/>
-        </w:rPr>
-        <w:t>neuron↔stimulus</w:t>
-      </w:r>
-      <w:proofErr w:type="spellEnd"/>
-      <w:r>
-        <w:rPr>
-          <w:b/>
-          <w:bCs/>
-        </w:rPr>
-        <w:t xml:space="preserve"> relabeling, to the flipped assignment — so Model 4 adds nothing and need not be run. One caution: as literally transcribed ("same W for all neurons, W differs across stimuli"), the response stops depending on neuron index and the population becomes rank-1 (all neurons identical), which is degenerate rather than equivalent to Model 3. Please confirm the intended statement is the factorization-symmetry point and not the verbatim one.</w:t>
-      </w:r>
-    </w:p>
-    <w:p>
-      <w:pPr>
-        <w:rPr>
-          <w:b/>
-          <w:bCs/>
-        </w:rPr>
-      </w:pPr>
-      <w:r>
-        <w:rPr>
-          <w:b/>
-          <w:bCs/>
-        </w:rPr>
-        <w:t xml:space="preserve">Model 5 — EX with an extra latent. AC and EC are Model 3 (shared θ, κ; rank 2). EX gets an additional EX-only variable </w:t>
-      </w:r>
-      <w:proofErr w:type="spellStart"/>
-      <w:r>
-        <w:rPr>
-          <w:b/>
-          <w:bCs/>
-        </w:rPr>
-        <w:t>ψ_s</w:t>
-      </w:r>
-      <w:proofErr w:type="spellEnd"/>
-      <w:r>
-        <w:rPr>
-          <w:b/>
-          <w:bCs/>
-        </w:rPr>
-        <w:t xml:space="preserve"> ("complexity"/distractor): μ_{</w:t>
-      </w:r>
-      <w:proofErr w:type="gramStart"/>
-      <w:r>
-        <w:rPr>
-          <w:b/>
-          <w:bCs/>
-        </w:rPr>
-        <w:t>·,EX</w:t>
-      </w:r>
-      <w:proofErr w:type="gramEnd"/>
-      <w:r>
-        <w:rPr>
-          <w:b/>
-          <w:bCs/>
-        </w:rPr>
-        <w:t>} = W_EX</w:t>
-      </w:r>
-      <w:proofErr w:type="gramStart"/>
-      <w:r>
-        <w:rPr>
-          <w:b/>
-          <w:bCs/>
-        </w:rPr>
-        <w:t>·[</w:t>
-      </w:r>
-      <w:proofErr w:type="gramEnd"/>
-      <w:r>
-        <w:rPr>
-          <w:b/>
-          <w:bCs/>
-        </w:rPr>
-        <w:t xml:space="preserve">θ; κ; ψ], W_EX </w:t>
-      </w:r>
-      <w:r>
-        <w:rPr>
-          <w:rFonts w:ascii="Cambria Math" w:hAnsi="Cambria Math" w:cs="Cambria Math"/>
-          <w:b/>
-          <w:bCs/>
-        </w:rPr>
-        <w:t>∈</w:t>
-      </w:r>
-      <w:r>
-        <w:rPr>
-          <w:b/>
-          <w:bCs/>
-        </w:rPr>
-        <w:t xml:space="preserve"> </w:t>
-      </w:r>
-      <w:r>
-        <w:rPr>
-          <w:rFonts w:ascii="Cambria Math" w:hAnsi="Cambria Math" w:cs="Cambria Math"/>
-          <w:b/>
-          <w:bCs/>
-        </w:rPr>
-        <w:t>ℝ</w:t>
-      </w:r>
-      <w:r>
-        <w:rPr>
-          <w:b/>
-          <w:bCs/>
-        </w:rPr>
-        <w:t>^{N</w:t>
+        <w:t>∘</w:t>
       </w:r>
       <w:r>
         <w:rPr>
@@ -2486,30 +1725,14 @@
           <w:b/>
           <w:bCs/>
         </w:rPr>
-        <w:t>×</w:t>
-      </w:r>
-      <w:r>
-        <w:rPr>
-          <w:b/>
-          <w:bCs/>
-        </w:rPr>
-        <w:t>3}, rank 3, PR_EX &gt; PR_{</w:t>
-      </w:r>
-      <w:proofErr w:type="gramStart"/>
-      <w:r>
-        <w:rPr>
-          <w:b/>
-          <w:bCs/>
-        </w:rPr>
-        <w:t>AC,EC</w:t>
-      </w:r>
-      <w:proofErr w:type="gramEnd"/>
-      <w:r>
-        <w:rPr>
-          <w:b/>
-          <w:bCs/>
-        </w:rPr>
-        <w:t>}. AC</w:t>
+        <w:t>κ</w:t>
+      </w:r>
+      <w:r>
+        <w:rPr>
+          <w:b/>
+          <w:bCs/>
+        </w:rPr>
+        <w:t xml:space="preserve">], the product feature </w:t>
       </w:r>
       <w:r>
         <w:rPr>
@@ -2517,14 +1740,14 @@
           <w:b/>
           <w:bCs/>
         </w:rPr>
-        <w:t>↔</w:t>
-      </w:r>
-      <w:r>
-        <w:rPr>
-          <w:b/>
-          <w:bCs/>
-        </w:rPr>
-        <w:t>EC PT works as in Model 3; AC/EC</w:t>
+        <w:t>θ</w:t>
+      </w:r>
+      <w:r>
+        <w:rPr>
+          <w:b/>
+          <w:bCs/>
+        </w:rPr>
+        <w:t>_s</w:t>
       </w:r>
       <w:r>
         <w:rPr>
@@ -2532,193 +1755,6 @@
           <w:b/>
           <w:bCs/>
         </w:rPr>
-        <w:t>↔</w:t>
-      </w:r>
-      <w:r>
-        <w:rPr>
-          <w:b/>
-          <w:bCs/>
-        </w:rPr>
-        <w:t>EX PT is partial — the shared (</w:t>
-      </w:r>
-      <w:proofErr w:type="spellStart"/>
-      <w:proofErr w:type="gramStart"/>
-      <w:r>
-        <w:rPr>
-          <w:b/>
-          <w:bCs/>
-        </w:rPr>
-        <w:t>θ,κ</w:t>
-      </w:r>
-      <w:proofErr w:type="spellEnd"/>
-      <w:proofErr w:type="gramEnd"/>
-      <w:r>
-        <w:rPr>
-          <w:b/>
-          <w:bCs/>
-        </w:rPr>
-        <w:t xml:space="preserve">) plane transfers, but the ψ axis has no counterpart in AC/EC and acts as non-transferable scatter, degrading transfer in proportion to </w:t>
-      </w:r>
-      <w:proofErr w:type="spellStart"/>
-      <w:r>
-        <w:rPr>
-          <w:b/>
-          <w:bCs/>
-        </w:rPr>
-        <w:t>ψ's</w:t>
-      </w:r>
-      <w:proofErr w:type="spellEnd"/>
-      <w:r>
-        <w:rPr>
-          <w:b/>
-          <w:bCs/>
-        </w:rPr>
-        <w:t xml:space="preserve"> variance share. This matches the empirical intuition that EX is "very different" and carries extra image structure. Design choice: whether </w:t>
-      </w:r>
-      <w:proofErr w:type="gramStart"/>
-      <w:r>
-        <w:rPr>
-          <w:b/>
-          <w:bCs/>
-        </w:rPr>
-        <w:t>ψ is</w:t>
-      </w:r>
-      <w:proofErr w:type="gramEnd"/>
-      <w:r>
-        <w:rPr>
-          <w:b/>
-          <w:bCs/>
-        </w:rPr>
-        <w:t xml:space="preserve"> independent of (</w:t>
-      </w:r>
-      <w:proofErr w:type="spellStart"/>
-      <w:proofErr w:type="gramStart"/>
-      <w:r>
-        <w:rPr>
-          <w:b/>
-          <w:bCs/>
-        </w:rPr>
-        <w:t>θ,κ</w:t>
-      </w:r>
-      <w:proofErr w:type="spellEnd"/>
-      <w:proofErr w:type="gramEnd"/>
-      <w:r>
-        <w:rPr>
-          <w:b/>
-          <w:bCs/>
-        </w:rPr>
-        <w:t>) (pure orthogonal nuisance) or correlated with them.</w:t>
-      </w:r>
-    </w:p>
-    <w:p>
-      <w:pPr>
-        <w:rPr>
-          <w:b/>
-          <w:bCs/>
-        </w:rPr>
-      </w:pPr>
-      <w:r>
-        <w:rPr>
-          <w:b/>
-          <w:bCs/>
-        </w:rPr>
-        <w:t>Model 6 — nonlinear mixed selectivity. μ_{</w:t>
-      </w:r>
-      <w:proofErr w:type="gramStart"/>
-      <w:r>
-        <w:rPr>
-          <w:b/>
-          <w:bCs/>
-        </w:rPr>
-        <w:t>·,c</w:t>
-      </w:r>
-      <w:proofErr w:type="gramEnd"/>
-      <w:r>
-        <w:rPr>
-          <w:b/>
-          <w:bCs/>
-        </w:rPr>
-        <w:t xml:space="preserve">} = </w:t>
-      </w:r>
-      <w:proofErr w:type="spellStart"/>
-      <w:r>
-        <w:rPr>
-          <w:b/>
-          <w:bCs/>
-        </w:rPr>
-        <w:t>W_c</w:t>
-      </w:r>
-      <w:proofErr w:type="spellEnd"/>
-      <w:proofErr w:type="gramStart"/>
-      <w:r>
-        <w:rPr>
-          <w:b/>
-          <w:bCs/>
-        </w:rPr>
-        <w:t>·[</w:t>
-      </w:r>
-      <w:proofErr w:type="gramEnd"/>
-      <w:r>
-        <w:rPr>
-          <w:b/>
-          <w:bCs/>
-        </w:rPr>
-        <w:t xml:space="preserve">θ; κ; </w:t>
-      </w:r>
-      <w:proofErr w:type="spellStart"/>
-      <w:r>
-        <w:rPr>
-          <w:b/>
-          <w:bCs/>
-        </w:rPr>
-        <w:t>θ</w:t>
-      </w:r>
-      <w:r>
-        <w:rPr>
-          <w:rFonts w:ascii="Cambria Math" w:hAnsi="Cambria Math" w:cs="Cambria Math"/>
-          <w:b/>
-          <w:bCs/>
-        </w:rPr>
-        <w:t>∘</w:t>
-      </w:r>
-      <w:r>
-        <w:rPr>
-          <w:rFonts w:ascii="Aptos" w:hAnsi="Aptos" w:cs="Aptos"/>
-          <w:b/>
-          <w:bCs/>
-        </w:rPr>
-        <w:t>κ</w:t>
-      </w:r>
-      <w:proofErr w:type="spellEnd"/>
-      <w:r>
-        <w:rPr>
-          <w:b/>
-          <w:bCs/>
-        </w:rPr>
-        <w:t xml:space="preserve">], the product feature </w:t>
-      </w:r>
-      <w:proofErr w:type="spellStart"/>
-      <w:r>
-        <w:rPr>
-          <w:rFonts w:ascii="Aptos" w:hAnsi="Aptos" w:cs="Aptos"/>
-          <w:b/>
-          <w:bCs/>
-        </w:rPr>
-        <w:t>θ</w:t>
-      </w:r>
-      <w:r>
-        <w:rPr>
-          <w:b/>
-          <w:bCs/>
-        </w:rPr>
-        <w:t>_s</w:t>
-      </w:r>
-      <w:r>
-        <w:rPr>
-          <w:rFonts w:ascii="Aptos" w:hAnsi="Aptos" w:cs="Aptos"/>
-          <w:b/>
-          <w:bCs/>
-        </w:rPr>
         <w:t>·κ</w:t>
       </w:r>
       <w:r>
@@ -2726,31 +1762,7 @@
           <w:b/>
           <w:bCs/>
         </w:rPr>
-        <w:t>_s</w:t>
-      </w:r>
-      <w:proofErr w:type="spellEnd"/>
-      <w:r>
-        <w:rPr>
-          <w:b/>
-          <w:bCs/>
-        </w:rPr>
-        <w:t xml:space="preserve"> shared across cues, </w:t>
-      </w:r>
-      <w:proofErr w:type="spellStart"/>
-      <w:r>
-        <w:rPr>
-          <w:b/>
-          <w:bCs/>
-        </w:rPr>
-        <w:t>W_c</w:t>
-      </w:r>
-      <w:proofErr w:type="spellEnd"/>
-      <w:r>
-        <w:rPr>
-          <w:b/>
-          <w:bCs/>
-        </w:rPr>
-        <w:t xml:space="preserve"> </w:t>
+        <w:t xml:space="preserve">_s shared across cues, W_c </w:t>
       </w:r>
       <w:r>
         <w:rPr>
@@ -2828,6 +1840,66 @@
           <w:bCs/>
         </w:rPr>
       </w:pPr>
+    </w:p>
+    <w:p>
+      <w:pPr>
+        <w:rPr>
+          <w:b/>
+          <w:bCs/>
+        </w:rPr>
+      </w:pPr>
+      <w:r>
+        <w:rPr>
+          <w:b/>
+          <w:bCs/>
+        </w:rPr>
+        <w:t>7/23/2026</w:t>
+      </w:r>
+    </w:p>
+    <w:p>
+      <w:pPr>
+        <w:rPr>
+          <w:b/>
+          <w:bCs/>
+        </w:rPr>
+      </w:pPr>
+      <w:r>
+        <w:rPr>
+          <w:b/>
+          <w:bCs/>
+        </w:rPr>
+        <w:t>PC incremental decoding</w:t>
+      </w:r>
+    </w:p>
+    <w:p>
+      <w:pPr>
+        <w:rPr>
+          <w:b/>
+          <w:bCs/>
+        </w:rPr>
+      </w:pPr>
+      <w:r>
+        <w:rPr>
+          <w:b/>
+          <w:bCs/>
+        </w:rPr>
+        <w:t>CCGP decoding</w:t>
+      </w:r>
+    </w:p>
+    <w:p>
+      <w:pPr>
+        <w:rPr>
+          <w:b/>
+          <w:bCs/>
+        </w:rPr>
+      </w:pPr>
+      <w:r>
+        <w:rPr>
+          <w:b/>
+          <w:bCs/>
+        </w:rPr>
+        <w:t>PT residual</w:t>
+      </w:r>
     </w:p>
     <w:sectPr>
       <w:pgSz w:w="12240" w:h="15840"/>
@@ -3681,6 +2753,7 @@
   <w:style w:type="character" w:default="1" w:styleId="DefaultParagraphFont">
     <w:name w:val="Default Paragraph Font"/>
     <w:uiPriority w:val="1"/>
+    <w:semiHidden/>
     <w:unhideWhenUsed/>
   </w:style>
   <w:style w:type="table" w:default="1" w:styleId="TableNormal">

</xml_diff>